<commit_message>
docs(laporan): update Iman draft and testing evidence
</commit_message>
<xml_diff>
--- a/Surat Pengajuan UAT (Update Invitees).docx
+++ b/Surat Pengajuan UAT (Update Invitees).docx
@@ -478,7 +478,269 @@
         </w:rPr>
       </w:pPr>
       <w:r>
-        <w:t>Bersama ini kami mengajukan permohonan untuk melaksanakan User Acceptance Testing (UAT) yang ditujukan kepada Dosen Penguji (Dr. Widya Cholil, M.I.T. dan Kharisma Wiati Gusti, M.T.), Dosen Pembimbing (Dr. Ridwan Raafi’udin, S.Kom., M.Kom. dan Novi Trisman Hadi, S.Pd., M.Kom.), serta perwakilan Hubungan Masyarakat (Humas) UPNVJ selaku calon end-user mahasiswa, sebagai tahapan evaluasi dan validasi prototipe pada penyusunan Project Tugas Akhir di Fakultas Ilmu Komputer UPN “Veteran” Jakarta.</w:t>
+        <w:t xml:space="preserve">Bersama </w:t>
+      </w:r>
+      <w:proofErr w:type="spellStart"/>
+      <w:r>
+        <w:t>ini</w:t>
+      </w:r>
+      <w:proofErr w:type="spellEnd"/>
+      <w:r>
+        <w:t xml:space="preserve"> kami </w:t>
+      </w:r>
+      <w:proofErr w:type="spellStart"/>
+      <w:r>
+        <w:t>mengajukan</w:t>
+      </w:r>
+      <w:proofErr w:type="spellEnd"/>
+      <w:r>
+        <w:t xml:space="preserve"> </w:t>
+      </w:r>
+      <w:proofErr w:type="spellStart"/>
+      <w:r>
+        <w:t>permohonan</w:t>
+      </w:r>
+      <w:proofErr w:type="spellEnd"/>
+      <w:r>
+        <w:t xml:space="preserve"> </w:t>
+      </w:r>
+      <w:proofErr w:type="spellStart"/>
+      <w:r>
+        <w:t>untuk</w:t>
+      </w:r>
+      <w:proofErr w:type="spellEnd"/>
+      <w:r>
+        <w:t xml:space="preserve"> </w:t>
+      </w:r>
+      <w:proofErr w:type="spellStart"/>
+      <w:r>
+        <w:t>melaksanakan</w:t>
+      </w:r>
+      <w:proofErr w:type="spellEnd"/>
+      <w:r>
+        <w:t xml:space="preserve"> User Acceptance Testing (UAT) yang </w:t>
+      </w:r>
+      <w:proofErr w:type="spellStart"/>
+      <w:r>
+        <w:t>ditujukan</w:t>
+      </w:r>
+      <w:proofErr w:type="spellEnd"/>
+      <w:r>
+        <w:t xml:space="preserve"> </w:t>
+      </w:r>
+      <w:proofErr w:type="spellStart"/>
+      <w:r>
+        <w:t>kepada</w:t>
+      </w:r>
+      <w:proofErr w:type="spellEnd"/>
+      <w:r>
+        <w:t xml:space="preserve"> Dosen </w:t>
+      </w:r>
+      <w:proofErr w:type="spellStart"/>
+      <w:r>
+        <w:t>Penguji</w:t>
+      </w:r>
+      <w:proofErr w:type="spellEnd"/>
+      <w:r>
+        <w:t xml:space="preserve"> (Dr. Widya Cholil, M.I.T. dan Kharisma Wiati Gusti, M.T.), Dosen </w:t>
+      </w:r>
+      <w:proofErr w:type="spellStart"/>
+      <w:r>
+        <w:t>Pembimbing</w:t>
+      </w:r>
+      <w:proofErr w:type="spellEnd"/>
+      <w:r>
+        <w:t xml:space="preserve"> (Dr. Ridwan Raafi’udin, </w:t>
+      </w:r>
+      <w:proofErr w:type="spellStart"/>
+      <w:proofErr w:type="gramStart"/>
+      <w:r>
+        <w:t>S.Kom</w:t>
+      </w:r>
+      <w:proofErr w:type="spellEnd"/>
+      <w:proofErr w:type="gramEnd"/>
+      <w:r>
+        <w:t xml:space="preserve">., </w:t>
+      </w:r>
+      <w:proofErr w:type="spellStart"/>
+      <w:proofErr w:type="gramStart"/>
+      <w:r>
+        <w:t>M.Kom</w:t>
+      </w:r>
+      <w:proofErr w:type="spellEnd"/>
+      <w:proofErr w:type="gramEnd"/>
+      <w:r>
+        <w:t xml:space="preserve">. dan Novi </w:t>
+      </w:r>
+      <w:proofErr w:type="spellStart"/>
+      <w:r>
+        <w:t>Trisman</w:t>
+      </w:r>
+      <w:proofErr w:type="spellEnd"/>
+      <w:r>
+        <w:t xml:space="preserve"> Hadi, </w:t>
+      </w:r>
+      <w:proofErr w:type="spellStart"/>
+      <w:r>
+        <w:t>S.Pd</w:t>
+      </w:r>
+      <w:proofErr w:type="spellEnd"/>
+      <w:r>
+        <w:t xml:space="preserve">., </w:t>
+      </w:r>
+      <w:proofErr w:type="spellStart"/>
+      <w:proofErr w:type="gramStart"/>
+      <w:r>
+        <w:t>M.Kom</w:t>
+      </w:r>
+      <w:proofErr w:type="spellEnd"/>
+      <w:proofErr w:type="gramEnd"/>
+      <w:r>
+        <w:t xml:space="preserve">.), </w:t>
+      </w:r>
+      <w:proofErr w:type="spellStart"/>
+      <w:r>
+        <w:t>serta</w:t>
+      </w:r>
+      <w:proofErr w:type="spellEnd"/>
+      <w:r>
+        <w:t xml:space="preserve"> </w:t>
+      </w:r>
+      <w:proofErr w:type="spellStart"/>
+      <w:r>
+        <w:t>perwakilan</w:t>
+      </w:r>
+      <w:proofErr w:type="spellEnd"/>
+      <w:r>
+        <w:t xml:space="preserve"> </w:t>
+      </w:r>
+      <w:proofErr w:type="spellStart"/>
+      <w:r>
+        <w:t>Hubungan</w:t>
+      </w:r>
+      <w:proofErr w:type="spellEnd"/>
+      <w:r>
+        <w:t xml:space="preserve"> Masyarakat (Humas) UPNVJ </w:t>
+      </w:r>
+      <w:proofErr w:type="spellStart"/>
+      <w:r>
+        <w:t>selaku</w:t>
+      </w:r>
+      <w:proofErr w:type="spellEnd"/>
+      <w:r>
+        <w:t xml:space="preserve"> </w:t>
+      </w:r>
+      <w:proofErr w:type="spellStart"/>
+      <w:r>
+        <w:t>calon</w:t>
+      </w:r>
+      <w:proofErr w:type="spellEnd"/>
+      <w:r>
+        <w:t xml:space="preserve"> end-user </w:t>
+      </w:r>
+      <w:proofErr w:type="spellStart"/>
+      <w:r>
+        <w:t>mahasiswa</w:t>
+      </w:r>
+      <w:proofErr w:type="spellEnd"/>
+      <w:r>
+        <w:t xml:space="preserve">, dan Admin Program Studi (Prodi) </w:t>
+      </w:r>
+      <w:proofErr w:type="spellStart"/>
+      <w:r>
+        <w:t>selaku</w:t>
+      </w:r>
+      <w:proofErr w:type="spellEnd"/>
+      <w:r>
+        <w:t xml:space="preserve"> </w:t>
+      </w:r>
+      <w:proofErr w:type="spellStart"/>
+      <w:r>
+        <w:t>calon</w:t>
+      </w:r>
+      <w:proofErr w:type="spellEnd"/>
+      <w:r>
+        <w:t xml:space="preserve"> </w:t>
+      </w:r>
+      <w:proofErr w:type="spellStart"/>
+      <w:r>
+        <w:t>pengelola</w:t>
+      </w:r>
+      <w:proofErr w:type="spellEnd"/>
+      <w:r>
+        <w:t xml:space="preserve"> Dashboard Admin, </w:t>
+      </w:r>
+      <w:proofErr w:type="spellStart"/>
+      <w:r>
+        <w:t>sebagai</w:t>
+      </w:r>
+      <w:proofErr w:type="spellEnd"/>
+      <w:r>
+        <w:t xml:space="preserve"> </w:t>
+      </w:r>
+      <w:proofErr w:type="spellStart"/>
+      <w:r>
+        <w:t>tahapan</w:t>
+      </w:r>
+      <w:proofErr w:type="spellEnd"/>
+      <w:r>
+        <w:t xml:space="preserve"> </w:t>
+      </w:r>
+      <w:proofErr w:type="spellStart"/>
+      <w:r>
+        <w:t>evaluasi</w:t>
+      </w:r>
+      <w:proofErr w:type="spellEnd"/>
+      <w:r>
+        <w:t xml:space="preserve"> dan </w:t>
+      </w:r>
+      <w:proofErr w:type="spellStart"/>
+      <w:r>
+        <w:t>validasi</w:t>
+      </w:r>
+      <w:proofErr w:type="spellEnd"/>
+      <w:r>
+        <w:t xml:space="preserve"> </w:t>
+      </w:r>
+      <w:proofErr w:type="spellStart"/>
+      <w:r>
+        <w:t>prototipe</w:t>
+      </w:r>
+      <w:proofErr w:type="spellEnd"/>
+      <w:r>
+        <w:t xml:space="preserve"> pada </w:t>
+      </w:r>
+      <w:proofErr w:type="spellStart"/>
+      <w:r>
+        <w:t>penyusunan</w:t>
+      </w:r>
+      <w:proofErr w:type="spellEnd"/>
+      <w:r>
+        <w:t xml:space="preserve"> Project </w:t>
+      </w:r>
+      <w:proofErr w:type="spellStart"/>
+      <w:r>
+        <w:t>Tugas</w:t>
+      </w:r>
+      <w:proofErr w:type="spellEnd"/>
+      <w:r>
+        <w:t xml:space="preserve"> Akhir di </w:t>
+      </w:r>
+      <w:proofErr w:type="spellStart"/>
+      <w:r>
+        <w:t>Fakultas</w:t>
+      </w:r>
+      <w:proofErr w:type="spellEnd"/>
+      <w:r>
+        <w:t xml:space="preserve"> </w:t>
+      </w:r>
+      <w:proofErr w:type="spellStart"/>
+      <w:r>
+        <w:t>Ilmu</w:t>
+      </w:r>
+      <w:proofErr w:type="spellEnd"/>
+      <w:r>
+        <w:t xml:space="preserve"> Komputer UPN “Veteran” Jakarta.</w:t>
       </w:r>
     </w:p>
     <w:p>
@@ -596,6 +858,7 @@
                 <w:szCs w:val="24"/>
               </w:rPr>
             </w:pPr>
+            <w:proofErr w:type="gramStart"/>
             <w:r>
               <w:rPr>
                 <w:rFonts w:ascii="Times New Roman" w:hAnsi="Times New Roman" w:cs="Times New Roman"/>
@@ -610,8 +873,9 @@
                 <w:sz w:val="24"/>
                 <w:szCs w:val="24"/>
               </w:rPr>
-              <w:t>3 Juli</w:t>
-            </w:r>
+              <w:t xml:space="preserve"> Juli</w:t>
+            </w:r>
+            <w:proofErr w:type="gramEnd"/>
             <w:r>
               <w:rPr>
                 <w:rFonts w:ascii="Times New Roman" w:hAnsi="Times New Roman" w:cs="Times New Roman"/>
@@ -655,13 +919,23 @@
                 <w:szCs w:val="24"/>
               </w:rPr>
             </w:pPr>
-            <w:r>
-              <w:rPr>
-                <w:rFonts w:ascii="Times New Roman" w:hAnsi="Times New Roman" w:cs="Times New Roman"/>
-                <w:sz w:val="24"/>
-                <w:szCs w:val="24"/>
-              </w:rPr>
-              <w:t>Pemohon,</w:t>
+            <w:proofErr w:type="spellStart"/>
+            <w:r>
+              <w:rPr>
+                <w:rFonts w:ascii="Times New Roman" w:hAnsi="Times New Roman" w:cs="Times New Roman"/>
+                <w:sz w:val="24"/>
+                <w:szCs w:val="24"/>
+              </w:rPr>
+              <w:t>Pemohon</w:t>
+            </w:r>
+            <w:proofErr w:type="spellEnd"/>
+            <w:r>
+              <w:rPr>
+                <w:rFonts w:ascii="Times New Roman" w:hAnsi="Times New Roman" w:cs="Times New Roman"/>
+                <w:sz w:val="24"/>
+                <w:szCs w:val="24"/>
+              </w:rPr>
+              <w:t>,</w:t>
             </w:r>
           </w:p>
         </w:tc>
@@ -691,7 +965,25 @@
                 <w:sz w:val="24"/>
                 <w:szCs w:val="24"/>
               </w:rPr>
-              <w:t>Dosen Pembimbing 1</w:t>
+              <w:t xml:space="preserve">Dosen </w:t>
+            </w:r>
+            <w:proofErr w:type="spellStart"/>
+            <w:r>
+              <w:rPr>
+                <w:rFonts w:ascii="Times New Roman" w:hAnsi="Times New Roman" w:cs="Times New Roman"/>
+                <w:sz w:val="24"/>
+                <w:szCs w:val="24"/>
+              </w:rPr>
+              <w:t>Pembimbing</w:t>
+            </w:r>
+            <w:proofErr w:type="spellEnd"/>
+            <w:r>
+              <w:rPr>
+                <w:rFonts w:ascii="Times New Roman" w:hAnsi="Times New Roman" w:cs="Times New Roman"/>
+                <w:sz w:val="24"/>
+                <w:szCs w:val="24"/>
+              </w:rPr>
+              <w:t xml:space="preserve"> 1</w:t>
             </w:r>
           </w:p>
         </w:tc>
@@ -845,7 +1137,47 @@
                 <w:sz w:val="24"/>
                 <w:szCs w:val="24"/>
               </w:rPr>
-              <w:t>Dr. Ridwan Raafi’udin, S.Kom, M.Kom.</w:t>
+              <w:t xml:space="preserve">Dr. Ridwan Raafi’udin, </w:t>
+            </w:r>
+            <w:proofErr w:type="spellStart"/>
+            <w:proofErr w:type="gramStart"/>
+            <w:r>
+              <w:rPr>
+                <w:rFonts w:ascii="Times New Roman" w:hAnsi="Times New Roman" w:cs="Times New Roman"/>
+                <w:sz w:val="24"/>
+                <w:szCs w:val="24"/>
+              </w:rPr>
+              <w:t>S.Kom</w:t>
+            </w:r>
+            <w:proofErr w:type="spellEnd"/>
+            <w:proofErr w:type="gramEnd"/>
+            <w:r>
+              <w:rPr>
+                <w:rFonts w:ascii="Times New Roman" w:hAnsi="Times New Roman" w:cs="Times New Roman"/>
+                <w:sz w:val="24"/>
+                <w:szCs w:val="24"/>
+              </w:rPr>
+              <w:t xml:space="preserve">, </w:t>
+            </w:r>
+            <w:proofErr w:type="spellStart"/>
+            <w:proofErr w:type="gramStart"/>
+            <w:r>
+              <w:rPr>
+                <w:rFonts w:ascii="Times New Roman" w:hAnsi="Times New Roman" w:cs="Times New Roman"/>
+                <w:sz w:val="24"/>
+                <w:szCs w:val="24"/>
+              </w:rPr>
+              <w:t>M.Kom</w:t>
+            </w:r>
+            <w:proofErr w:type="spellEnd"/>
+            <w:proofErr w:type="gramEnd"/>
+            <w:r>
+              <w:rPr>
+                <w:rFonts w:ascii="Times New Roman" w:hAnsi="Times New Roman" w:cs="Times New Roman"/>
+                <w:sz w:val="24"/>
+                <w:szCs w:val="24"/>
+              </w:rPr>
+              <w:t>.</w:t>
             </w:r>
           </w:p>
         </w:tc>
@@ -979,13 +1311,23 @@
                 <w:szCs w:val="24"/>
               </w:rPr>
             </w:pPr>
-            <w:r>
-              <w:rPr>
-                <w:rFonts w:ascii="Times New Roman" w:hAnsi="Times New Roman" w:cs="Times New Roman"/>
-                <w:sz w:val="24"/>
-                <w:szCs w:val="24"/>
-              </w:rPr>
-              <w:t>Mengetahui,</w:t>
+            <w:proofErr w:type="spellStart"/>
+            <w:r>
+              <w:rPr>
+                <w:rFonts w:ascii="Times New Roman" w:hAnsi="Times New Roman" w:cs="Times New Roman"/>
+                <w:sz w:val="24"/>
+                <w:szCs w:val="24"/>
+              </w:rPr>
+              <w:t>Mengetahui</w:t>
+            </w:r>
+            <w:proofErr w:type="spellEnd"/>
+            <w:r>
+              <w:rPr>
+                <w:rFonts w:ascii="Times New Roman" w:hAnsi="Times New Roman" w:cs="Times New Roman"/>
+                <w:sz w:val="24"/>
+                <w:szCs w:val="24"/>
+              </w:rPr>
+              <w:t>,</w:t>
             </w:r>
           </w:p>
         </w:tc>
@@ -1018,22 +1360,42 @@
                 <w:szCs w:val="24"/>
               </w:rPr>
             </w:pPr>
-            <w:r>
-              <w:rPr>
-                <w:rFonts w:ascii="Times New Roman" w:hAnsi="Times New Roman" w:cs="Times New Roman"/>
-                <w:sz w:val="24"/>
-                <w:szCs w:val="24"/>
-              </w:rPr>
-              <w:t>Koordinator Program Studi</w:t>
-            </w:r>
-            <w:r>
-              <w:rPr>
-                <w:rFonts w:ascii="Times New Roman" w:hAnsi="Times New Roman" w:cs="Times New Roman"/>
-                <w:sz w:val="24"/>
-                <w:szCs w:val="24"/>
-              </w:rPr>
-              <w:t xml:space="preserve"> S1 Informatika</w:t>
-            </w:r>
+            <w:proofErr w:type="spellStart"/>
+            <w:r>
+              <w:rPr>
+                <w:rFonts w:ascii="Times New Roman" w:hAnsi="Times New Roman" w:cs="Times New Roman"/>
+                <w:sz w:val="24"/>
+                <w:szCs w:val="24"/>
+              </w:rPr>
+              <w:t>Koordinator</w:t>
+            </w:r>
+            <w:proofErr w:type="spellEnd"/>
+            <w:r>
+              <w:rPr>
+                <w:rFonts w:ascii="Times New Roman" w:hAnsi="Times New Roman" w:cs="Times New Roman"/>
+                <w:sz w:val="24"/>
+                <w:szCs w:val="24"/>
+              </w:rPr>
+              <w:t xml:space="preserve"> Program Studi</w:t>
+            </w:r>
+            <w:r>
+              <w:rPr>
+                <w:rFonts w:ascii="Times New Roman" w:hAnsi="Times New Roman" w:cs="Times New Roman"/>
+                <w:sz w:val="24"/>
+                <w:szCs w:val="24"/>
+              </w:rPr>
+              <w:t xml:space="preserve"> S1 </w:t>
+            </w:r>
+            <w:proofErr w:type="spellStart"/>
+            <w:r>
+              <w:rPr>
+                <w:rFonts w:ascii="Times New Roman" w:hAnsi="Times New Roman" w:cs="Times New Roman"/>
+                <w:sz w:val="24"/>
+                <w:szCs w:val="24"/>
+              </w:rPr>
+              <w:t>Informatika</w:t>
+            </w:r>
+            <w:proofErr w:type="spellEnd"/>
           </w:p>
         </w:tc>
       </w:tr>
@@ -1106,6 +1468,16 @@
               </w:rPr>
             </w:pPr>
           </w:p>
+          <w:p>
+            <w:pPr>
+              <w:jc w:val="both"/>
+              <w:rPr>
+                <w:rFonts w:ascii="Times New Roman" w:hAnsi="Times New Roman" w:cs="Times New Roman"/>
+                <w:sz w:val="24"/>
+                <w:szCs w:val="24"/>
+              </w:rPr>
+            </w:pPr>
+          </w:p>
         </w:tc>
       </w:tr>
       <w:tr>
@@ -1142,7 +1514,47 @@
                 <w:sz w:val="24"/>
                 <w:szCs w:val="24"/>
               </w:rPr>
-              <w:t>Dr. Ridwan Raafi’udin, S.Kom, M.Kom.</w:t>
+              <w:t xml:space="preserve">Dr. Ridwan Raafi’udin, </w:t>
+            </w:r>
+            <w:proofErr w:type="spellStart"/>
+            <w:proofErr w:type="gramStart"/>
+            <w:r>
+              <w:rPr>
+                <w:rFonts w:ascii="Times New Roman" w:hAnsi="Times New Roman" w:cs="Times New Roman"/>
+                <w:sz w:val="24"/>
+                <w:szCs w:val="24"/>
+              </w:rPr>
+              <w:t>S.Kom</w:t>
+            </w:r>
+            <w:proofErr w:type="spellEnd"/>
+            <w:proofErr w:type="gramEnd"/>
+            <w:r>
+              <w:rPr>
+                <w:rFonts w:ascii="Times New Roman" w:hAnsi="Times New Roman" w:cs="Times New Roman"/>
+                <w:sz w:val="24"/>
+                <w:szCs w:val="24"/>
+              </w:rPr>
+              <w:t xml:space="preserve">, </w:t>
+            </w:r>
+            <w:proofErr w:type="spellStart"/>
+            <w:proofErr w:type="gramStart"/>
+            <w:r>
+              <w:rPr>
+                <w:rFonts w:ascii="Times New Roman" w:hAnsi="Times New Roman" w:cs="Times New Roman"/>
+                <w:sz w:val="24"/>
+                <w:szCs w:val="24"/>
+              </w:rPr>
+              <w:t>M.Kom</w:t>
+            </w:r>
+            <w:proofErr w:type="spellEnd"/>
+            <w:proofErr w:type="gramEnd"/>
+            <w:r>
+              <w:rPr>
+                <w:rFonts w:ascii="Times New Roman" w:hAnsi="Times New Roman" w:cs="Times New Roman"/>
+                <w:sz w:val="24"/>
+                <w:szCs w:val="24"/>
+              </w:rPr>
+              <w:t>.</w:t>
             </w:r>
           </w:p>
         </w:tc>

</xml_diff>